<commit_message>
docs: fix Hebrew right-to-left layout
</commit_message>
<xml_diff>
--- a/deliverables/01-KAOP-presentation-talk-guide-he.docx
+++ b/deliverables/01-KAOP-presentation-talk-guide-he.docx
@@ -10,6 +10,11 @@
         <w:bidi w:val="1"/>
       </w:pPr>
       <w:r>
+        <w:rPr>
+          <w:rFonts w:ascii="Arial" w:hAnsi="Arial" w:cs="Arial"/>
+          <w:rtl w:val="1"/>
+          <w:lang w:bidi="he-IL"/>
+        </w:rPr>
         <w:t>מדריך להעברת ההרצאה על KAOP</w:t>
       </w:r>
     </w:p>
@@ -24,6 +29,8 @@
           <w:rFonts w:ascii="Arial" w:hAnsi="Arial" w:cs="Arial"/>
           <w:color w:val="484848"/>
           <w:sz w:val="30"/>
+          <w:rtl w:val="1"/>
+          <w:lang w:bidi="he-IL"/>
         </w:rPr>
         <w:t>תסריט דיבור מלא למצגת ולמעבר לדמו</w:t>
       </w:r>
@@ -38,6 +45,8 @@
           <w:rFonts w:ascii="Arial" w:hAnsi="Arial" w:cs="Arial"/>
           <w:b/>
           <w:sz w:val="26"/>
+          <w:rtl w:val="0"/>
+          <w:lang w:val="en-US"/>
         </w:rPr>
         <w:t>KAOP by Nirit Terehovsky</w:t>
       </w:r>
@@ -52,6 +61,8 @@
           <w:rFonts w:ascii="Arial" w:hAnsi="Arial" w:cs="Arial"/>
           <w:color w:val="484848"/>
           <w:sz w:val="21"/>
+          <w:rtl w:val="1"/>
+          <w:lang w:bidi="he-IL"/>
         </w:rPr>
         <w:t>גרסה מעודכנת על בסיס הדמו המאומת מיום 7 באוקטובר 2026</w:t>
       </w:r>
@@ -69,77 +80,92 @@
         <w:keepNext/>
       </w:pPr>
       <w:r>
+        <w:rPr>
+          <w:rFonts w:ascii="Arial" w:hAnsi="Arial" w:cs="Arial"/>
+          <w:rtl w:val="1"/>
+          <w:lang w:bidi="he-IL"/>
+        </w:rPr>
         <w:t>תוכן המסמך</w:t>
       </w:r>
     </w:p>
     <w:p>
       <w:pPr>
-        <w:pStyle w:val="ListNumber"/>
-        <w:spacing w:after="100"/>
         <w:jc w:val="right"/>
         <w:bidi w:val="1"/>
+        <w:spacing w:after="100"/>
+        <w:ind w:right="420" w:hanging="260"/>
       </w:pPr>
       <w:r>
         <w:rPr>
           <w:rFonts w:ascii="Arial" w:hAnsi="Arial" w:cs="Arial"/>
+          <w:rtl w:val="1"/>
+          <w:lang w:bidi="he-IL"/>
         </w:rPr>
-        <w:t>מטרת ההרצאה והמסר המרכזי</w:t>
+        <w:t>1. מטרת ההרצאה והמסר המרכזי</w:t>
       </w:r>
     </w:p>
     <w:p>
       <w:pPr>
-        <w:pStyle w:val="ListNumber"/>
-        <w:spacing w:after="100"/>
         <w:jc w:val="right"/>
         <w:bidi w:val="1"/>
+        <w:spacing w:after="100"/>
+        <w:ind w:right="420" w:hanging="260"/>
       </w:pPr>
       <w:r>
         <w:rPr>
           <w:rFonts w:ascii="Arial" w:hAnsi="Arial" w:cs="Arial"/>
+          <w:rtl w:val="1"/>
+          <w:lang w:bidi="he-IL"/>
         </w:rPr>
-        <w:t>חלוקת הזמן</w:t>
+        <w:t>2. חלוקת הזמן</w:t>
       </w:r>
     </w:p>
     <w:p>
       <w:pPr>
-        <w:pStyle w:val="ListNumber"/>
-        <w:spacing w:after="100"/>
         <w:jc w:val="right"/>
         <w:bidi w:val="1"/>
+        <w:spacing w:after="100"/>
+        <w:ind w:right="420" w:hanging="260"/>
       </w:pPr>
       <w:r>
         <w:rPr>
           <w:rFonts w:ascii="Arial" w:hAnsi="Arial" w:cs="Arial"/>
+          <w:rtl w:val="1"/>
+          <w:lang w:bidi="he-IL"/>
         </w:rPr>
-        <w:t>תסריט לפי שקפים</w:t>
+        <w:t>3. תסריט לפי שקפים</w:t>
       </w:r>
     </w:p>
     <w:p>
       <w:pPr>
-        <w:pStyle w:val="ListNumber"/>
-        <w:spacing w:after="100"/>
         <w:jc w:val="right"/>
         <w:bidi w:val="1"/>
+        <w:spacing w:after="100"/>
+        <w:ind w:right="420" w:hanging="260"/>
       </w:pPr>
       <w:r>
         <w:rPr>
           <w:rFonts w:ascii="Arial" w:hAnsi="Arial" w:cs="Arial"/>
+          <w:rtl w:val="1"/>
+          <w:lang w:bidi="he-IL"/>
         </w:rPr>
-        <w:t>מעבר לדמו וסיום</w:t>
+        <w:t>4. מעבר לדמו וסיום</w:t>
       </w:r>
     </w:p>
     <w:p>
       <w:pPr>
-        <w:pStyle w:val="ListNumber"/>
-        <w:spacing w:after="100"/>
         <w:jc w:val="right"/>
         <w:bidi w:val="1"/>
+        <w:spacing w:after="100"/>
+        <w:ind w:right="420" w:hanging="260"/>
       </w:pPr>
       <w:r>
         <w:rPr>
           <w:rFonts w:ascii="Arial" w:hAnsi="Arial" w:cs="Arial"/>
+          <w:rtl w:val="1"/>
+          <w:lang w:bidi="he-IL"/>
         </w:rPr>
-        <w:t>שאלות צפויות ותשובות</w:t>
+        <w:t>5. שאלות צפויות ותשובות</w:t>
       </w:r>
     </w:p>
     <w:p>
@@ -155,6 +181,11 @@
         <w:keepNext/>
       </w:pPr>
       <w:r>
+        <w:rPr>
+          <w:rFonts w:ascii="Arial" w:hAnsi="Arial" w:cs="Arial"/>
+          <w:rtl w:val="1"/>
+          <w:lang w:bidi="he-IL"/>
+        </w:rPr>
         <w:t>מטרת ההרצאה והמסר המרכזי</w:t>
       </w:r>
     </w:p>
@@ -166,6 +197,8 @@
       <w:r>
         <w:rPr>
           <w:rFonts w:ascii="Arial" w:hAnsi="Arial" w:cs="Arial"/>
+          <w:rtl w:val="1"/>
+          <w:lang w:bidi="he-IL"/>
         </w:rPr>
         <w:t>המטרה שלי היא להראות כיצד KAOP נותנת לצוות Platform Engineering שכבת שליטה משותפת לסוכני AI שפועלים בסביבות ייצור. ההרצאה אינה מציגה אוסף תכונות. היא מציגה בעיה תפעולית, את מודל השליטה של KAOP, ולאחר מכן ראיות חיות מתוך incident אמיתי וסקירת קוד אמיתית.</w:t>
       </w:r>
@@ -178,6 +211,8 @@
       <w:r>
         <w:rPr>
           <w:rFonts w:ascii="Arial" w:hAnsi="Arial" w:cs="Arial"/>
+          <w:rtl w:val="1"/>
+          <w:lang w:bidi="he-IL"/>
         </w:rPr>
         <w:t>המסר המרכזי הוא שאפשר להרחיב שימוש בסוכנים בלי לוותר על הרשאות מוגבלות, עקיבות, אחריות ובקרה אנושית. בדמו הסוכן של Kubernetes קורא מידע בלבד בתוך namespace אחד. הסוכן של GitHub קורא קוד וכותב תגובת review בלבד.</w:t>
       </w:r>
@@ -190,12 +225,18 @@
         <w:keepNext/>
       </w:pPr>
       <w:r>
+        <w:rPr>
+          <w:rFonts w:ascii="Arial" w:hAnsi="Arial" w:cs="Arial"/>
+          <w:rtl w:val="1"/>
+          <w:lang w:bidi="he-IL"/>
+        </w:rPr>
         <w:t>חלוקת הזמן</w:t>
       </w:r>
     </w:p>
     <w:tbl>
       <w:tblPr>
         <w:tblStyle w:val="TableGrid"/>
+        <w:bidiVisual w:val="1"/>
         <w:tblW w:type="auto" w:w="0"/>
         <w:jc w:val="center"/>
         <w:tblLayout w:type="autofit"/>
@@ -242,6 +283,8 @@
                 <w:b/>
                 <w:color w:val="FFFFFF"/>
                 <w:sz w:val="21"/>
+                <w:rtl w:val="1"/>
+                <w:lang w:bidi="he-IL"/>
               </w:rPr>
               <w:t>חלק</w:t>
             </w:r>
@@ -270,6 +313,8 @@
                 <w:b/>
                 <w:color w:val="FFFFFF"/>
                 <w:sz w:val="21"/>
+                <w:rtl w:val="1"/>
+                <w:lang w:bidi="he-IL"/>
               </w:rPr>
               <w:t>זמן מומלץ</w:t>
             </w:r>
@@ -298,6 +343,8 @@
                 <w:b/>
                 <w:color w:val="FFFFFF"/>
                 <w:sz w:val="21"/>
+                <w:rtl w:val="1"/>
+                <w:lang w:bidi="he-IL"/>
               </w:rPr>
               <w:t>מטרה</w:t>
             </w:r>
@@ -328,6 +375,8 @@
               <w:rPr>
                 <w:rFonts w:ascii="Arial" w:hAnsi="Arial" w:cs="Arial"/>
                 <w:sz w:val="20"/>
+                <w:rtl w:val="1"/>
+                <w:lang w:bidi="he-IL"/>
               </w:rPr>
               <w:t>פתיחה ושקפים 1 עד 3</w:t>
             </w:r>
@@ -353,6 +402,8 @@
               <w:rPr>
                 <w:rFonts w:ascii="Arial" w:hAnsi="Arial" w:cs="Arial"/>
                 <w:sz w:val="20"/>
+                <w:rtl w:val="1"/>
+                <w:lang w:bidi="he-IL"/>
               </w:rPr>
               <w:t>3 דקות</w:t>
             </w:r>
@@ -378,6 +429,8 @@
               <w:rPr>
                 <w:rFonts w:ascii="Arial" w:hAnsi="Arial" w:cs="Arial"/>
                 <w:sz w:val="20"/>
+                <w:rtl w:val="1"/>
+                <w:lang w:bidi="he-IL"/>
               </w:rPr>
               <w:t>הגדרת בעיית agent sprawl והפער בין agent מקומי להפעלה בייצור</w:t>
             </w:r>
@@ -409,6 +462,8 @@
               <w:rPr>
                 <w:rFonts w:ascii="Arial" w:hAnsi="Arial" w:cs="Arial"/>
                 <w:sz w:val="20"/>
+                <w:rtl w:val="1"/>
+                <w:lang w:bidi="he-IL"/>
               </w:rPr>
               <w:t>שקפים 4 עד 7</w:t>
             </w:r>
@@ -435,6 +490,8 @@
               <w:rPr>
                 <w:rFonts w:ascii="Arial" w:hAnsi="Arial" w:cs="Arial"/>
                 <w:sz w:val="20"/>
+                <w:rtl w:val="1"/>
+                <w:lang w:bidi="he-IL"/>
               </w:rPr>
               <w:t>4 דקות</w:t>
             </w:r>
@@ -461,6 +518,8 @@
               <w:rPr>
                 <w:rFonts w:ascii="Arial" w:hAnsi="Arial" w:cs="Arial"/>
                 <w:sz w:val="20"/>
+                <w:rtl w:val="1"/>
+                <w:lang w:bidi="he-IL"/>
               </w:rPr>
               <w:t>הסבר על control plane, workflow, governance ו-run evidence</w:t>
             </w:r>
@@ -491,6 +550,8 @@
               <w:rPr>
                 <w:rFonts w:ascii="Arial" w:hAnsi="Arial" w:cs="Arial"/>
                 <w:sz w:val="20"/>
+                <w:rtl w:val="1"/>
+                <w:lang w:bidi="he-IL"/>
               </w:rPr>
               <w:t>שקפים 8 עד 9</w:t>
             </w:r>
@@ -516,6 +577,8 @@
               <w:rPr>
                 <w:rFonts w:ascii="Arial" w:hAnsi="Arial" w:cs="Arial"/>
                 <w:sz w:val="20"/>
+                <w:rtl w:val="1"/>
+                <w:lang w:bidi="he-IL"/>
               </w:rPr>
               <w:t>2 דקות</w:t>
             </w:r>
@@ -541,6 +604,8 @@
               <w:rPr>
                 <w:rFonts w:ascii="Arial" w:hAnsi="Arial" w:cs="Arial"/>
                 <w:sz w:val="20"/>
+                <w:rtl w:val="1"/>
+                <w:lang w:bidi="he-IL"/>
               </w:rPr>
               <w:t>הכנת הקהל לדמו ולמודל האימוץ</w:t>
             </w:r>
@@ -572,6 +637,8 @@
               <w:rPr>
                 <w:rFonts w:ascii="Arial" w:hAnsi="Arial" w:cs="Arial"/>
                 <w:sz w:val="20"/>
+                <w:rtl w:val="1"/>
+                <w:lang w:bidi="he-IL"/>
               </w:rPr>
               <w:t>שקפים 10 עד 12</w:t>
             </w:r>
@@ -598,6 +665,8 @@
               <w:rPr>
                 <w:rFonts w:ascii="Arial" w:hAnsi="Arial" w:cs="Arial"/>
                 <w:sz w:val="20"/>
+                <w:rtl w:val="1"/>
+                <w:lang w:bidi="he-IL"/>
               </w:rPr>
               <w:t>2 עד 3 דקות</w:t>
             </w:r>
@@ -624,6 +693,8 @@
               <w:rPr>
                 <w:rFonts w:ascii="Arial" w:hAnsi="Arial" w:cs="Arial"/>
                 <w:sz w:val="20"/>
+                <w:rtl w:val="1"/>
+                <w:lang w:bidi="he-IL"/>
               </w:rPr>
               <w:t>שקפי appendix לפי שאלות או כהכנה טכנית קצרה</w:t>
             </w:r>
@@ -654,6 +725,8 @@
               <w:rPr>
                 <w:rFonts w:ascii="Arial" w:hAnsi="Arial" w:cs="Arial"/>
                 <w:sz w:val="20"/>
+                <w:rtl w:val="1"/>
+                <w:lang w:bidi="he-IL"/>
               </w:rPr>
               <w:t>דמו חי</w:t>
             </w:r>
@@ -679,6 +752,8 @@
               <w:rPr>
                 <w:rFonts w:ascii="Arial" w:hAnsi="Arial" w:cs="Arial"/>
                 <w:sz w:val="20"/>
+                <w:rtl w:val="1"/>
+                <w:lang w:bidi="he-IL"/>
               </w:rPr>
               <w:t>עד 12 דקות</w:t>
             </w:r>
@@ -704,6 +779,8 @@
               <w:rPr>
                 <w:rFonts w:ascii="Arial" w:hAnsi="Arial" w:cs="Arial"/>
                 <w:sz w:val="20"/>
+                <w:rtl w:val="1"/>
+                <w:lang w:bidi="he-IL"/>
               </w:rPr>
               <w:t>אירוע, alert, RCA, review והתאוששות</w:t>
             </w:r>
@@ -720,6 +797,11 @@
         <w:keepNext/>
       </w:pPr>
       <w:r>
+        <w:rPr>
+          <w:rFonts w:ascii="Arial" w:hAnsi="Arial" w:cs="Arial"/>
+          <w:rtl w:val="1"/>
+          <w:lang w:bidi="he-IL"/>
+        </w:rPr>
         <w:t>תסריט לפי שקפים</w:t>
       </w:r>
     </w:p>
@@ -731,6 +813,11 @@
         <w:keepNext/>
       </w:pPr>
       <w:r>
+        <w:rPr>
+          <w:rFonts w:ascii="Arial" w:hAnsi="Arial" w:cs="Arial"/>
+          <w:rtl w:val="1"/>
+          <w:lang w:bidi="he-IL"/>
+        </w:rPr>
         <w:t>שקף 1 KAOP by Nirit Terehovsky</w:t>
       </w:r>
     </w:p>
@@ -742,6 +829,8 @@
       <w:r>
         <w:rPr>
           <w:rFonts w:ascii="Arial" w:hAnsi="Arial" w:cs="Arial"/>
+          <w:rtl w:val="1"/>
+          <w:lang w:bidi="he-IL"/>
         </w:rPr>
         <w:t>כדאי לפתוח במשפט הבא: צוותי פיתוח כבר משתמשים בסוכנים. השאלה של צוות הפלטפורמה היא כיצד להרחיב את השימוש בלי לאבד שליטה על הרשאות, ראיות, עלות ואחריות. היום אראה כיצד KAOP מספקת שכבת הפעלה משותפת לסוכנים בסביבת ייצור.</w:t>
       </w:r>
@@ -755,12 +844,16 @@
         <w:rPr>
           <w:rFonts w:ascii="Arial" w:hAnsi="Arial" w:cs="Arial"/>
           <w:b/>
+          <w:rtl w:val="1"/>
+          <w:lang w:bidi="he-IL"/>
         </w:rPr>
         <w:t>המעבר:</w:t>
       </w:r>
       <w:r>
         <w:rPr>
           <w:rFonts w:ascii="Arial" w:hAnsi="Arial" w:cs="Arial"/>
+          <w:rtl w:val="1"/>
+          <w:lang w:bidi="he-IL"/>
         </w:rPr>
         <w:t xml:space="preserve"> כדי להבין מדוע נדרשת שכבה כזאת, נתחיל במה שקורה כאשר כל צוות מאמץ סוכן באופן עצמאי.</w:t>
       </w:r>
@@ -773,6 +866,11 @@
         <w:keepNext/>
       </w:pPr>
       <w:r>
+        <w:rPr>
+          <w:rFonts w:ascii="Arial" w:hAnsi="Arial" w:cs="Arial"/>
+          <w:rtl w:val="1"/>
+          <w:lang w:bidi="he-IL"/>
+        </w:rPr>
         <w:t>שקף 2 The agent sprawl problem</w:t>
       </w:r>
     </w:p>
@@ -784,6 +882,8 @@
       <w:r>
         <w:rPr>
           <w:rFonts w:ascii="Arial" w:hAnsi="Arial" w:cs="Arial"/>
+          <w:rtl w:val="1"/>
+          <w:lang w:bidi="he-IL"/>
         </w:rPr>
         <w:t>כל צוות יכול לבחור runtime, מודל, credentials ותהליך review משלו. ההתקדמות המקומית מהירה, אבל צוות הפלטפורמה מתקשה לענות על שאלות בסיסיות: אילו סוכנים פועלים, למי יש גישה, מי אישר פעולה, ואילו ראיות נשמרו.</w:t>
       </w:r>
@@ -797,12 +897,16 @@
         <w:rPr>
           <w:rFonts w:ascii="Arial" w:hAnsi="Arial" w:cs="Arial"/>
           <w:b/>
+          <w:rtl w:val="1"/>
+          <w:lang w:bidi="he-IL"/>
         </w:rPr>
         <w:t>המעבר:</w:t>
       </w:r>
       <w:r>
         <w:rPr>
           <w:rFonts w:ascii="Arial" w:hAnsi="Arial" w:cs="Arial"/>
+          <w:rtl w:val="1"/>
+          <w:lang w:bidi="he-IL"/>
         </w:rPr>
         <w:t xml:space="preserve"> גם agent מצוין מבחינה פונקציונלית עדיין חסר את מעטפת הייצור.</w:t>
       </w:r>
@@ -815,6 +919,11 @@
         <w:keepNext/>
       </w:pPr>
       <w:r>
+        <w:rPr>
+          <w:rFonts w:ascii="Arial" w:hAnsi="Arial" w:cs="Arial"/>
+          <w:rtl w:val="1"/>
+          <w:lang w:bidi="he-IL"/>
+        </w:rPr>
         <w:t>שקף 3 Why isolated agents fail in production</w:t>
       </w:r>
     </w:p>
@@ -826,6 +935,8 @@
       <w:r>
         <w:rPr>
           <w:rFonts w:ascii="Arial" w:hAnsi="Arial" w:cs="Arial"/>
+          <w:rtl w:val="1"/>
+          <w:lang w:bidi="he-IL"/>
         </w:rPr>
         <w:t>יכולת reasoning לבדה אינה מספיקה. סוכן בסביבת ייצור צריך הרשאות מוגדרות, trigger אמין, workflow חוזר, ראיות לכלי העבודה שלו, ומסלול approval לפעולות מסוכנות. אחרת כל צוות בונה מעטפת שונה עם פערים אחרים.</w:t>
       </w:r>
@@ -839,12 +950,16 @@
         <w:rPr>
           <w:rFonts w:ascii="Arial" w:hAnsi="Arial" w:cs="Arial"/>
           <w:b/>
+          <w:rtl w:val="1"/>
+          <w:lang w:bidi="he-IL"/>
         </w:rPr>
         <w:t>המעבר:</w:t>
       </w:r>
       <w:r>
         <w:rPr>
           <w:rFonts w:ascii="Arial" w:hAnsi="Arial" w:cs="Arial"/>
+          <w:rtl w:val="1"/>
+          <w:lang w:bidi="he-IL"/>
         </w:rPr>
         <w:t xml:space="preserve"> KAOP מרכזת את המעטפת הזאת ב-control plane אחד.</w:t>
       </w:r>
@@ -857,6 +972,11 @@
         <w:keepNext/>
       </w:pPr>
       <w:r>
+        <w:rPr>
+          <w:rFonts w:ascii="Arial" w:hAnsi="Arial" w:cs="Arial"/>
+          <w:rtl w:val="1"/>
+          <w:lang w:bidi="he-IL"/>
+        </w:rPr>
         <w:t>שקף 4 The KAOP control plane</w:t>
       </w:r>
     </w:p>
@@ -868,6 +988,8 @@
       <w:r>
         <w:rPr>
           <w:rFonts w:ascii="Arial" w:hAnsi="Arial" w:cs="Arial"/>
+          <w:rtl w:val="1"/>
+          <w:lang w:bidi="he-IL"/>
         </w:rPr>
         <w:t>KAOP מפרידה בין הסוכן לבין התשתית שמנהלת אותו. Fleet מציג inventory ובעלות. Run מטפל ב-triggers וב-workflows. Context מחבר ידע ואינטגרציות. Govern אוכף RBAC, credentials, guardrails ו-approvals. כך אפשר לנהל סוכנים ממקורות שונים תחת מודל הפעלה אחד.</w:t>
       </w:r>
@@ -881,12 +1003,16 @@
         <w:rPr>
           <w:rFonts w:ascii="Arial" w:hAnsi="Arial" w:cs="Arial"/>
           <w:b/>
+          <w:rtl w:val="1"/>
+          <w:lang w:bidi="he-IL"/>
         </w:rPr>
         <w:t>המעבר:</w:t>
       </w:r>
       <w:r>
         <w:rPr>
           <w:rFonts w:ascii="Arial" w:hAnsi="Arial" w:cs="Arial"/>
+          <w:rtl w:val="1"/>
+          <w:lang w:bidi="he-IL"/>
         </w:rPr>
         <w:t xml:space="preserve"> נראה כיצד control plane הופך alert לתהליך חקירה מובנה.</w:t>
       </w:r>
@@ -899,6 +1025,11 @@
         <w:keepNext/>
       </w:pPr>
       <w:r>
+        <w:rPr>
+          <w:rFonts w:ascii="Arial" w:hAnsi="Arial" w:cs="Arial"/>
+          <w:rtl w:val="1"/>
+          <w:lang w:bidi="he-IL"/>
+        </w:rPr>
         <w:t>שקף 5 Workflow orchestration from trigger to outcome</w:t>
       </w:r>
     </w:p>
@@ -910,6 +1041,8 @@
       <w:r>
         <w:rPr>
           <w:rFonts w:ascii="Arial" w:hAnsi="Arial" w:cs="Arial"/>
+          <w:rtl w:val="1"/>
+          <w:lang w:bidi="he-IL"/>
         </w:rPr>
         <w:t>ה-workflow מתחיל ב-Grafana alert, אוסף ראיות מ-Kubernetes, מחזיר RCA מובנה, משאיר החלטה מסוכנת לאדם ושומר run record. ה-output contract דורש root cause, evidence, confidence, affected resources ו-suggested fix. המבנה מאפשר לאנשים ולשלבים נוספים להשתמש בתוצאה.</w:t>
       </w:r>
@@ -923,12 +1056,16 @@
         <w:rPr>
           <w:rFonts w:ascii="Arial" w:hAnsi="Arial" w:cs="Arial"/>
           <w:b/>
+          <w:rtl w:val="1"/>
+          <w:lang w:bidi="he-IL"/>
         </w:rPr>
         <w:t>המעבר:</w:t>
       </w:r>
       <w:r>
         <w:rPr>
           <w:rFonts w:ascii="Arial" w:hAnsi="Arial" w:cs="Arial"/>
+          <w:rtl w:val="1"/>
+          <w:lang w:bidi="he-IL"/>
         </w:rPr>
         <w:t xml:space="preserve"> ה-workflow שימושי רק אם ההרשאות שלו נאכפות בפועל.</w:t>
       </w:r>
@@ -941,6 +1078,11 @@
         <w:keepNext/>
       </w:pPr>
       <w:r>
+        <w:rPr>
+          <w:rFonts w:ascii="Arial" w:hAnsi="Arial" w:cs="Arial"/>
+          <w:rtl w:val="1"/>
+          <w:lang w:bidi="he-IL"/>
+        </w:rPr>
         <w:t>שקף 6 Governance boundaries</w:t>
       </w:r>
     </w:p>
@@ -952,6 +1094,8 @@
       <w:r>
         <w:rPr>
           <w:rFonts w:ascii="Arial" w:hAnsi="Arial" w:cs="Arial"/>
+          <w:rtl w:val="1"/>
+          <w:lang w:bidi="he-IL"/>
         </w:rPr>
         <w:t>בצד Kubernetes יצרתי ServiceAccount שמוגבל ל-namespace kaop-demo ולפעולות get, list ו-watch. הוא אינו יכול לקרוא Secrets, לבצע write או לפתוח pods exec. בצד GitHub ה-reviewer יכול לקרוא repository ו-PR ולכתוב תגובת review, אך אינו יכול push או merge.</w:t>
       </w:r>
@@ -965,12 +1109,16 @@
         <w:rPr>
           <w:rFonts w:ascii="Arial" w:hAnsi="Arial" w:cs="Arial"/>
           <w:b/>
+          <w:rtl w:val="1"/>
+          <w:lang w:bidi="he-IL"/>
         </w:rPr>
         <w:t>המעבר:</w:t>
       </w:r>
       <w:r>
         <w:rPr>
           <w:rFonts w:ascii="Arial" w:hAnsi="Arial" w:cs="Arial"/>
+          <w:rtl w:val="1"/>
+          <w:lang w:bidi="he-IL"/>
         </w:rPr>
         <w:t xml:space="preserve"> מעבר להגבלת גישה, צוות הפלטפורמה צריך יכולת לבדוק מה קרה בכל run.</w:t>
       </w:r>
@@ -983,6 +1131,11 @@
         <w:keepNext/>
       </w:pPr>
       <w:r>
+        <w:rPr>
+          <w:rFonts w:ascii="Arial" w:hAnsi="Arial" w:cs="Arial"/>
+          <w:rtl w:val="1"/>
+          <w:lang w:bidi="he-IL"/>
+        </w:rPr>
         <w:t>שקף 7 Fleet visibility and auditability</w:t>
       </w:r>
     </w:p>
@@ -994,6 +1147,8 @@
       <w:r>
         <w:rPr>
           <w:rFonts w:ascii="Arial" w:hAnsi="Arial" w:cs="Arial"/>
+          <w:rtl w:val="1"/>
+          <w:lang w:bidi="he-IL"/>
         </w:rPr>
         <w:t>Run history מרכז ownership, inputs, tool calls, policy decisions ותוצאה. במקום לשחזר אירוע מתוך terminals ולוגים מפוזרים, צוות הפלטפורמה מקבל record אחד שניתן לבדיקה. בדמו נראה run אמיתי עם 15 tool calls ו-high confidence finding.</w:t>
       </w:r>
@@ -1007,12 +1162,16 @@
         <w:rPr>
           <w:rFonts w:ascii="Arial" w:hAnsi="Arial" w:cs="Arial"/>
           <w:b/>
+          <w:rtl w:val="1"/>
+          <w:lang w:bidi="he-IL"/>
         </w:rPr>
         <w:t>המעבר:</w:t>
       </w:r>
       <w:r>
         <w:rPr>
           <w:rFonts w:ascii="Arial" w:hAnsi="Arial" w:cs="Arial"/>
+          <w:rtl w:val="1"/>
+          <w:lang w:bidi="he-IL"/>
         </w:rPr>
         <w:t xml:space="preserve"> עכשיו אפשר לעבור ממודל תאורטי לראיות החיות.</w:t>
       </w:r>
@@ -1025,6 +1184,11 @@
         <w:keepNext/>
       </w:pPr>
       <w:r>
+        <w:rPr>
+          <w:rFonts w:ascii="Arial" w:hAnsi="Arial" w:cs="Arial"/>
+          <w:rtl w:val="1"/>
+          <w:lang w:bidi="he-IL"/>
+        </w:rPr>
         <w:t>שקף 8 Live platform tour</w:t>
       </w:r>
     </w:p>
@@ -1036,6 +1200,8 @@
       <w:r>
         <w:rPr>
           <w:rFonts w:ascii="Arial" w:hAnsi="Arial" w:cs="Arial"/>
+          <w:rtl w:val="1"/>
+          <w:lang w:bidi="he-IL"/>
         </w:rPr>
         <w:t>הדמו מחבר שלוש מערכות. Grafana מזהה restarts ושולחת webhook. KAOP מפעילה RCA מוגבל הרשאות. GitHub מציג PR פתוח עם review של AgentOps. התקלה נוצרת באמצעות make incident ומסירה endpoints אמיתיים משירות Redis.</w:t>
       </w:r>
@@ -1049,12 +1215,16 @@
         <w:rPr>
           <w:rFonts w:ascii="Arial" w:hAnsi="Arial" w:cs="Arial"/>
           <w:b/>
+          <w:rtl w:val="1"/>
+          <w:lang w:bidi="he-IL"/>
         </w:rPr>
         <w:t>המעבר:</w:t>
       </w:r>
       <w:r>
         <w:rPr>
           <w:rFonts w:ascii="Arial" w:hAnsi="Arial" w:cs="Arial"/>
+          <w:rtl w:val="1"/>
+          <w:lang w:bidi="he-IL"/>
         </w:rPr>
         <w:t xml:space="preserve"> לפני הדמו, חשוב להסביר כיצד מרחיבים autonomy בצורה מבוקרת.</w:t>
       </w:r>
@@ -1067,6 +1237,11 @@
         <w:keepNext/>
       </w:pPr>
       <w:r>
+        <w:rPr>
+          <w:rFonts w:ascii="Arial" w:hAnsi="Arial" w:cs="Arial"/>
+          <w:rtl w:val="1"/>
+          <w:lang w:bidi="he-IL"/>
+        </w:rPr>
         <w:t>שקף 9 A governed path to agent adoption</w:t>
       </w:r>
     </w:p>
@@ -1078,6 +1253,8 @@
       <w:r>
         <w:rPr>
           <w:rFonts w:ascii="Arial" w:hAnsi="Arial" w:cs="Arial"/>
+          <w:rtl w:val="1"/>
+          <w:lang w:bidi="he-IL"/>
         </w:rPr>
         <w:t>הגישה המומלצת מתחילה ב-read only ובתוצאה מדידה. לאחר שנצברות ראיות אפשר לעבור להמלצות, להצעות write עם approval, ורק לבסוף לאוטומציה צרה. בדמו אנו נשארים בשלב Observe כדי לשמור על blast radius ברור.</w:t>
       </w:r>
@@ -1091,12 +1268,16 @@
         <w:rPr>
           <w:rFonts w:ascii="Arial" w:hAnsi="Arial" w:cs="Arial"/>
           <w:b/>
+          <w:rtl w:val="1"/>
+          <w:lang w:bidi="he-IL"/>
         </w:rPr>
         <w:t>המעבר:</w:t>
       </w:r>
       <w:r>
         <w:rPr>
           <w:rFonts w:ascii="Arial" w:hAnsi="Arial" w:cs="Arial"/>
+          <w:rtl w:val="1"/>
+          <w:lang w:bidi="he-IL"/>
         </w:rPr>
         <w:t xml:space="preserve"> בשלב זה עוברים לדמו. שקפים 10 עד 12 זמינים לדיון טכני או כ-fallback.</w:t>
       </w:r>
@@ -1109,6 +1290,11 @@
         <w:keepNext/>
       </w:pPr>
       <w:r>
+        <w:rPr>
+          <w:rFonts w:ascii="Arial" w:hAnsi="Arial" w:cs="Arial"/>
+          <w:rtl w:val="1"/>
+          <w:lang w:bidi="he-IL"/>
+        </w:rPr>
         <w:t>שקף 10 Demo architecture</w:t>
       </w:r>
     </w:p>
@@ -1120,6 +1306,8 @@
       <w:r>
         <w:rPr>
           <w:rFonts w:ascii="Arial" w:hAnsi="Arial" w:cs="Arial"/>
+          <w:rtl w:val="1"/>
+          <w:lang w:bidi="he-IL"/>
         </w:rPr>
         <w:t>Grafana Cloud מקבלת metrics מה-cluster. alert שולח webhook ל-KAOP. סוכן RCA קורא את namespace kaop-demo בלבד. GitHub מחזיק את PR התיקון. אותו incident מחבר את החקירה ואת סקירת הקוד, ולכן הדמו נשאר סיפור אחד ולא feature tour מפוצל.</w:t>
       </w:r>
@@ -1133,12 +1321,16 @@
         <w:rPr>
           <w:rFonts w:ascii="Arial" w:hAnsi="Arial" w:cs="Arial"/>
           <w:b/>
+          <w:rtl w:val="1"/>
+          <w:lang w:bidi="he-IL"/>
         </w:rPr>
         <w:t>המעבר:</w:t>
       </w:r>
       <w:r>
         <w:rPr>
           <w:rFonts w:ascii="Arial" w:hAnsi="Arial" w:cs="Arial"/>
+          <w:rtl w:val="1"/>
+          <w:lang w:bidi="he-IL"/>
         </w:rPr>
         <w:t xml:space="preserve"> אם עולה שאלה על הרשאות, עוברים למטריצה בשקף הבא.</w:t>
       </w:r>
@@ -1151,6 +1343,11 @@
         <w:keepNext/>
       </w:pPr>
       <w:r>
+        <w:rPr>
+          <w:rFonts w:ascii="Arial" w:hAnsi="Arial" w:cs="Arial"/>
+          <w:rtl w:val="1"/>
+          <w:lang w:bidi="he-IL"/>
+        </w:rPr>
         <w:t>שקף 11 Permission matrix</w:t>
       </w:r>
     </w:p>
@@ -1162,6 +1359,8 @@
       <w:r>
         <w:rPr>
           <w:rFonts w:ascii="Arial" w:hAnsi="Arial" w:cs="Arial"/>
+          <w:rtl w:val="1"/>
+          <w:lang w:bidi="he-IL"/>
         </w:rPr>
         <w:t>המילה Denied היא חלק מההוכחה. היא מציינת שהגישה ל-Secrets ולפעולות write חסומה במפורש באמצעות RBAC. אין מדובר בכשל חיבור. זהו גבול אבטחה שנבדק עם kubectl auth can-i. גם GitHub מוגבל ל-read ולכתיבת comment.</w:t>
       </w:r>
@@ -1175,12 +1374,16 @@
         <w:rPr>
           <w:rFonts w:ascii="Arial" w:hAnsi="Arial" w:cs="Arial"/>
           <w:b/>
+          <w:rtl w:val="1"/>
+          <w:lang w:bidi="he-IL"/>
         </w:rPr>
         <w:t>המעבר:</w:t>
       </w:r>
       <w:r>
         <w:rPr>
           <w:rFonts w:ascii="Arial" w:hAnsi="Arial" w:cs="Arial"/>
+          <w:rtl w:val="1"/>
+          <w:lang w:bidi="he-IL"/>
         </w:rPr>
         <w:t xml:space="preserve"> השקף האחרון מסכם את ההבדל בין מצב תקין, incident והתאוששות.</w:t>
       </w:r>
@@ -1193,6 +1396,11 @@
         <w:keepNext/>
       </w:pPr>
       <w:r>
+        <w:rPr>
+          <w:rFonts w:ascii="Arial" w:hAnsi="Arial" w:cs="Arial"/>
+          <w:rtl w:val="1"/>
+          <w:lang w:bidi="he-IL"/>
+        </w:rPr>
         <w:t>שקף 12 Incident evidence and recovery</w:t>
       </w:r>
     </w:p>
@@ -1204,6 +1412,8 @@
       <w:r>
         <w:rPr>
           <w:rFonts w:ascii="Arial" w:hAnsi="Arial" w:cs="Arial"/>
+          <w:rtl w:val="1"/>
+          <w:lang w:bidi="he-IL"/>
         </w:rPr>
         <w:t>במצב תקין יש Redis endpoint ושני frontend Pods מוכנים. ב-incident ה-selector אינו תואם ל-Pods, אין endpoint, ה-Pod החדש אינו Ready ונצפו שבעה restarts. לאחר make recover ה-endpoint חוזר, ה-Pods מוכנים ו-Grafana חוזרת ל-Normal.</w:t>
       </w:r>
@@ -1217,12 +1427,16 @@
         <w:rPr>
           <w:rFonts w:ascii="Arial" w:hAnsi="Arial" w:cs="Arial"/>
           <w:b/>
+          <w:rtl w:val="1"/>
+          <w:lang w:bidi="he-IL"/>
         </w:rPr>
         <w:t>המעבר:</w:t>
       </w:r>
       <w:r>
         <w:rPr>
           <w:rFonts w:ascii="Arial" w:hAnsi="Arial" w:cs="Arial"/>
+          <w:rtl w:val="1"/>
+          <w:lang w:bidi="he-IL"/>
         </w:rPr>
         <w:t xml:space="preserve"> מכאן מסיימים במסר העסקי או חוזרים למסכי ה-run לצורך שאלות.</w:t>
       </w:r>
@@ -1235,6 +1449,11 @@
         <w:keepNext/>
       </w:pPr>
       <w:r>
+        <w:rPr>
+          <w:rFonts w:ascii="Arial" w:hAnsi="Arial" w:cs="Arial"/>
+          <w:rtl w:val="1"/>
+          <w:lang w:bidi="he-IL"/>
+        </w:rPr>
         <w:t>מעבר לדמו וסיום</w:t>
       </w:r>
     </w:p>
@@ -1246,6 +1465,8 @@
       <w:r>
         <w:rPr>
           <w:rFonts w:ascii="Arial" w:hAnsi="Arial" w:cs="Arial"/>
+          <w:rtl w:val="1"/>
+          <w:lang w:bidi="he-IL"/>
         </w:rPr>
         <w:t>משפט מעבר מומלץ: כעת אראה את אותו מודל בפעולה. נתחיל מההרשאות ומה-run history, ניצור תקלה אמיתית, נראה את Grafana מפעילה RCA, נבדוק את ה-review ב-GitHub ולבסוף נחזיר את המערכת למצב תקין.</w:t>
       </w:r>
@@ -1258,6 +1479,8 @@
       <w:r>
         <w:rPr>
           <w:rFonts w:ascii="Arial" w:hAnsi="Arial" w:cs="Arial"/>
+          <w:rtl w:val="1"/>
+          <w:lang w:bidi="he-IL"/>
         </w:rPr>
         <w:t>משפט סיום מומלץ: הערך של KAOP הוא שכבת ההפעלה סביב הסוכנים. צוות הפלטפורמה מקבל מקום אחד להריץ workflows, לאכוף גבולות ולשמור ראיות. צוותי המוצר יכולים להמשיך לאמץ סוכנים בלי להפוך גישה והרשאות לתהליך בלתי נראה.</w:t>
       </w:r>
@@ -1270,12 +1493,18 @@
         <w:keepNext/>
       </w:pPr>
       <w:r>
+        <w:rPr>
+          <w:rFonts w:ascii="Arial" w:hAnsi="Arial" w:cs="Arial"/>
+          <w:rtl w:val="1"/>
+          <w:lang w:bidi="he-IL"/>
+        </w:rPr>
         <w:t>שאלות צפויות ותשובות</w:t>
       </w:r>
     </w:p>
     <w:tbl>
       <w:tblPr>
         <w:tblStyle w:val="TableGrid"/>
+        <w:bidiVisual w:val="1"/>
         <w:tblW w:type="auto" w:w="0"/>
         <w:jc w:val="center"/>
         <w:tblLayout w:type="autofit"/>
@@ -1321,6 +1550,8 @@
                 <w:b/>
                 <w:color w:val="FFFFFF"/>
                 <w:sz w:val="21"/>
+                <w:rtl w:val="1"/>
+                <w:lang w:bidi="he-IL"/>
               </w:rPr>
               <w:t>שאלה</w:t>
             </w:r>
@@ -1349,6 +1580,8 @@
                 <w:b/>
                 <w:color w:val="FFFFFF"/>
                 <w:sz w:val="21"/>
+                <w:rtl w:val="1"/>
+                <w:lang w:bidi="he-IL"/>
               </w:rPr>
               <w:t>תשובה קצרה</w:t>
             </w:r>
@@ -1379,6 +1612,8 @@
               <w:rPr>
                 <w:rFonts w:ascii="Arial" w:hAnsi="Arial" w:cs="Arial"/>
                 <w:sz w:val="20"/>
+                <w:rtl w:val="1"/>
+                <w:lang w:bidi="he-IL"/>
               </w:rPr>
               <w:t>למה לא לאפשר remediation אוטומטי</w:t>
             </w:r>
@@ -1404,6 +1639,8 @@
               <w:rPr>
                 <w:rFonts w:ascii="Arial" w:hAnsi="Arial" w:cs="Arial"/>
                 <w:sz w:val="20"/>
+                <w:rtl w:val="1"/>
+                <w:lang w:bidi="he-IL"/>
               </w:rPr>
               <w:t>המטרה בדמו היא להוכיח שליטה וחקירה לפני הרחבת autonomy. write אוטומטי יגדיל את הסיכון ויסיט את הדיון מה-governance.</w:t>
             </w:r>
@@ -1435,6 +1672,8 @@
               <w:rPr>
                 <w:rFonts w:ascii="Arial" w:hAnsi="Arial" w:cs="Arial"/>
                 <w:sz w:val="20"/>
+                <w:rtl w:val="1"/>
+                <w:lang w:bidi="he-IL"/>
               </w:rPr>
               <w:t>האם KAOP קוראת Secrets</w:t>
             </w:r>
@@ -1461,6 +1700,8 @@
               <w:rPr>
                 <w:rFonts w:ascii="Arial" w:hAnsi="Arial" w:cs="Arial"/>
                 <w:sz w:val="20"/>
+                <w:rtl w:val="1"/>
+                <w:lang w:bidi="he-IL"/>
               </w:rPr>
               <w:t>לא. ה-Role אינו כולל את resource secrets. בדיקת kubectl auth can-i מחזירה no.</w:t>
             </w:r>
@@ -1491,6 +1732,8 @@
               <w:rPr>
                 <w:rFonts w:ascii="Arial" w:hAnsi="Arial" w:cs="Arial"/>
                 <w:sz w:val="20"/>
+                <w:rtl w:val="1"/>
+                <w:lang w:bidi="he-IL"/>
               </w:rPr>
               <w:t>למה ה-liveness probe נפרד מ-readiness</w:t>
             </w:r>
@@ -1516,6 +1759,8 @@
               <w:rPr>
                 <w:rFonts w:ascii="Arial" w:hAnsi="Arial" w:cs="Arial"/>
                 <w:sz w:val="20"/>
+                <w:rtl w:val="1"/>
+                <w:lang w:bidi="he-IL"/>
               </w:rPr>
               <w:t>readiness יכולה לשקף תלות ב-Redis ולהוציא Pod מה-Service. liveness צריכה לבדוק אם התהליך עצמו חי. חיבור liveness לתלות חיצונית יוצר restart loop מיותר.</w:t>
             </w:r>
@@ -1547,6 +1792,8 @@
               <w:rPr>
                 <w:rFonts w:ascii="Arial" w:hAnsi="Arial" w:cs="Arial"/>
                 <w:sz w:val="20"/>
+                <w:rtl w:val="1"/>
+                <w:lang w:bidi="he-IL"/>
               </w:rPr>
               <w:t>האם ה-alert באמת הפעיל את KAOP</w:t>
             </w:r>
@@ -1573,6 +1820,8 @@
               <w:rPr>
                 <w:rFonts w:ascii="Arial" w:hAnsi="Arial" w:cs="Arial"/>
                 <w:sz w:val="20"/>
+                <w:rtl w:val="1"/>
+                <w:lang w:bidi="he-IL"/>
               </w:rPr>
               <w:t>כן. Grafana שלחה webhook לאחר מעבר ל-Firing. ה-run המאומת הוא run_e15c91fc04701d47c908ec0f.</w:t>
             </w:r>
@@ -1603,6 +1852,8 @@
               <w:rPr>
                 <w:rFonts w:ascii="Arial" w:hAnsi="Arial" w:cs="Arial"/>
                 <w:sz w:val="20"/>
+                <w:rtl w:val="1"/>
+                <w:lang w:bidi="he-IL"/>
               </w:rPr>
               <w:t>האם reviewer יכול לשנות קוד</w:t>
             </w:r>
@@ -1628,6 +1879,8 @@
               <w:rPr>
                 <w:rFonts w:ascii="Arial" w:hAnsi="Arial" w:cs="Arial"/>
                 <w:sz w:val="20"/>
+                <w:rtl w:val="1"/>
+                <w:lang w:bidi="he-IL"/>
               </w:rPr>
               <w:t>לא. האינטגרציה מספקת קריאת תוכן ו-PR וכתיבת review בלבד. ה-PR נשאר פתוח.</w:t>
             </w:r>
@@ -1659,6 +1912,8 @@
               <w:rPr>
                 <w:rFonts w:ascii="Arial" w:hAnsi="Arial" w:cs="Arial"/>
                 <w:sz w:val="20"/>
+                <w:rtl w:val="1"/>
+                <w:lang w:bidi="he-IL"/>
               </w:rPr>
               <w:t>מה מייצג Denied בשקף 11</w:t>
             </w:r>
@@ -1685,6 +1940,8 @@
               <w:rPr>
                 <w:rFonts w:ascii="Arial" w:hAnsi="Arial" w:cs="Arial"/>
                 <w:sz w:val="20"/>
+                <w:rtl w:val="1"/>
+                <w:lang w:bidi="he-IL"/>
               </w:rPr>
               <w:t>Denied מציין פעולה שנחסמה בכוונה על ידי מנגנון ההרשאות. זו הוכחת governance, לא סטטוס תקלה.</w:t>
             </w:r>
@@ -1699,6 +1956,7 @@
       <w:pgMar w:top="1191" w:right="1247" w:bottom="1020" w:left="1247" w:header="720" w:footer="720" w:gutter="0"/>
       <w:cols w:space="720"/>
       <w:docGrid w:linePitch="360"/>
+      <w:bidi w:val="1"/>
     </w:sectPr>
   </w:body>
 </w:document>
@@ -1716,6 +1974,8 @@
         <w:rFonts w:ascii="Arial" w:hAnsi="Arial" w:cs="Arial"/>
         <w:color w:val="484848"/>
         <w:sz w:val="18"/>
+        <w:rtl w:val="0"/>
+        <w:lang w:val="en-US"/>
       </w:rPr>
       <w:fldChar w:fldCharType="begin"/>
       <w:instrText xml:space="preserve"> PAGE </w:instrText>
@@ -2090,6 +2350,8 @@
     <w:rsid w:val="00FC693F"/>
     <w:pPr>
       <w:spacing w:after="140" w:line="269" w:lineRule="auto"/>
+      <w:jc w:val="right"/>
+      <w:bidi w:val="1"/>
     </w:pPr>
     <w:rPr>
       <w:rFonts w:ascii="Arial" w:hAnsi="Arial" w:cs="Arial"/>
@@ -2152,7 +2414,9 @@
       <w:keepNext/>
       <w:keepLines/>
       <w:spacing w:before="240" w:after="120"/>
+      <w:jc w:val="right"/>
       <w:outlineLvl w:val="0"/>
+      <w:bidi w:val="1"/>
     </w:pPr>
     <w:rPr>
       <w:rFonts w:asciiTheme="majorHAnsi" w:eastAsiaTheme="majorEastAsia" w:hAnsiTheme="majorHAnsi" w:cstheme="majorBidi" w:ascii="Arial" w:hAnsi="Arial" w:cs="Arial"/>
@@ -2176,7 +2440,9 @@
       <w:keepNext/>
       <w:keepLines/>
       <w:spacing w:before="240" w:after="120"/>
+      <w:jc w:val="right"/>
       <w:outlineLvl w:val="1"/>
+      <w:bidi w:val="1"/>
     </w:pPr>
     <w:rPr>
       <w:rFonts w:asciiTheme="majorHAnsi" w:eastAsiaTheme="majorEastAsia" w:hAnsiTheme="majorHAnsi" w:cstheme="majorBidi" w:ascii="Arial" w:hAnsi="Arial" w:cs="Arial"/>
@@ -2200,7 +2466,9 @@
       <w:keepNext/>
       <w:keepLines/>
       <w:spacing w:before="240" w:after="120"/>
+      <w:jc w:val="right"/>
       <w:outlineLvl w:val="2"/>
+      <w:bidi w:val="1"/>
     </w:pPr>
     <w:rPr>
       <w:rFonts w:asciiTheme="majorHAnsi" w:eastAsiaTheme="majorEastAsia" w:hAnsiTheme="majorHAnsi" w:cstheme="majorBidi" w:ascii="Arial" w:hAnsi="Arial" w:cs="Arial"/>
@@ -2440,6 +2708,8 @@
     <w:pPr>
       <w:spacing w:after="300" w:line="240" w:lineRule="auto"/>
       <w:contextualSpacing/>
+      <w:jc w:val="right"/>
+      <w:bidi w:val="1"/>
     </w:pPr>
     <w:rPr>
       <w:rFonts w:asciiTheme="majorHAnsi" w:eastAsiaTheme="majorEastAsia" w:hAnsiTheme="majorHAnsi" w:cstheme="majorBidi" w:ascii="Arial" w:hAnsi="Arial" w:cs="Arial"/>

</xml_diff>